<commit_message>
feat: enhance expense report generation and preview functionality
- Added new expense data structure and finance confirmation assertions in documents.test.js.
- Updated news.browser.mjs to include document-values.js for improved document handling.
- Created README.md and artifact.md for the new kuluaruanne document template, detailing its structure and fidelity.
- Introduced document-values.js for plain-text field mapping and validation in expense reports.
- Implemented expense-preview.test.js to ensure accurate rendering and validation of expense previews, including handling of attachments and escaping of user input.
</commit_message>
<xml_diff>
--- a/staff-app/private/templates/documents/kuluaruanne/kuluaruanne.docx
+++ b/staff-app/private/templates/documents/kuluaruanne/kuluaruanne.docx
@@ -121,7 +121,7 @@
       <w:tr>
         <w:trPr>
           <w:cantSplit w:val="0"/>
-          <w:trHeight w:val="386" w:hRule="atLeast"/>
+          <w:trHeight w:val="219" w:hRule="atLeast"/>
           <w:tblHeader w:val="0"/>
         </w:trPr>
         <w:tc>
@@ -196,7 +196,7 @@
       <w:tr>
         <w:trPr>
           <w:cantSplit w:val="0"/>
-          <w:trHeight w:val="386" w:hRule="atLeast"/>
+          <w:trHeight w:val="431" w:hRule="atLeast"/>
           <w:tblHeader w:val="0"/>
         </w:trPr>
         <w:tc>
@@ -278,7 +278,7 @@
       <w:tr>
         <w:trPr>
           <w:cantSplit w:val="0"/>
-          <w:trHeight w:val="386" w:hRule="atLeast"/>
+          <w:trHeight w:val="219" w:hRule="atLeast"/>
           <w:tblHeader w:val="0"/>
         </w:trPr>
         <w:tc>
@@ -360,7 +360,7 @@
       <w:tr>
         <w:trPr>
           <w:cantSplit w:val="0"/>
-          <w:trHeight w:val="386" w:hRule="atLeast"/>
+          <w:trHeight w:val="219" w:hRule="atLeast"/>
           <w:tblHeader w:val="0"/>
         </w:trPr>
         <w:tc>
@@ -442,7 +442,7 @@
       <w:tr>
         <w:trPr>
           <w:cantSplit w:val="0"/>
-          <w:trHeight w:val="386" w:hRule="atLeast"/>
+          <w:trHeight w:val="219" w:hRule="atLeast"/>
           <w:tblHeader w:val="0"/>
         </w:trPr>
         <w:tc>
@@ -517,7 +517,7 @@
       <w:tr>
         <w:trPr>
           <w:cantSplit w:val="0"/>
-          <w:trHeight w:val="386" w:hRule="atLeast"/>
+          <w:trHeight w:val="225" w:hRule="atLeast"/>
           <w:tblHeader w:val="0"/>
         </w:trPr>
         <w:tc>
@@ -592,7 +592,7 @@
       <w:tr>
         <w:trPr>
           <w:cantSplit w:val="0"/>
-          <w:trHeight w:val="386" w:hRule="atLeast"/>
+          <w:trHeight w:val="219" w:hRule="atLeast"/>
           <w:tblHeader w:val="0"/>
         </w:trPr>
         <w:tc>
@@ -667,7 +667,7 @@
       <w:tr>
         <w:trPr>
           <w:cantSplit w:val="0"/>
-          <w:trHeight w:val="386" w:hRule="atLeast"/>
+          <w:trHeight w:val="219" w:hRule="atLeast"/>
           <w:tblHeader w:val="0"/>
         </w:trPr>
         <w:tc>
@@ -742,7 +742,7 @@
       <w:tr>
         <w:trPr>
           <w:cantSplit w:val="0"/>
-          <w:trHeight w:val="386" w:hRule="atLeast"/>
+          <w:trHeight w:val="219" w:hRule="atLeast"/>
           <w:tblHeader w:val="0"/>
         </w:trPr>
         <w:tc>
@@ -817,7 +817,7 @@
       <w:tr>
         <w:trPr>
           <w:cantSplit w:val="0"/>
-          <w:trHeight w:val="386" w:hRule="atLeast"/>
+          <w:trHeight w:val="225" w:hRule="atLeast"/>
           <w:tblHeader w:val="0"/>
         </w:trPr>
         <w:tc>
@@ -892,7 +892,7 @@
       <w:tr>
         <w:trPr>
           <w:cantSplit w:val="0"/>
-          <w:trHeight w:val="386" w:hRule="atLeast"/>
+          <w:trHeight w:val="219" w:hRule="atLeast"/>
           <w:tblHeader w:val="0"/>
         </w:trPr>
         <w:tc>
@@ -1023,7 +1023,7 @@
       <w:tr>
         <w:trPr>
           <w:cantSplit w:val="0"/>
-          <w:trHeight w:val="748" w:hRule="atLeast"/>
+          <w:trHeight w:val="579" w:hRule="atLeast"/>
           <w:tblHeader w:val="0"/>
         </w:trPr>
         <w:tc>
@@ -1098,7 +1098,7 @@
       <w:tr>
         <w:trPr>
           <w:cantSplit w:val="0"/>
-          <w:trHeight w:val="748" w:hRule="atLeast"/>
+          <w:trHeight w:val="579" w:hRule="atLeast"/>
           <w:tblHeader w:val="0"/>
         </w:trPr>
         <w:tc>
@@ -1173,7 +1173,7 @@
       <w:tr>
         <w:trPr>
           <w:cantSplit w:val="0"/>
-          <w:trHeight w:val="748" w:hRule="atLeast"/>
+          <w:trHeight w:val="579" w:hRule="atLeast"/>
           <w:tblHeader w:val="0"/>
         </w:trPr>
         <w:tc>
@@ -1248,7 +1248,7 @@
       <w:tr>
         <w:trPr>
           <w:cantSplit w:val="0"/>
-          <w:trHeight w:val="748" w:hRule="atLeast"/>
+          <w:trHeight w:val="579" w:hRule="atLeast"/>
           <w:tblHeader w:val="0"/>
         </w:trPr>
         <w:tc>
@@ -1323,7 +1323,7 @@
       <w:tr>
         <w:trPr>
           <w:cantSplit w:val="0"/>
-          <w:trHeight w:val="748" w:hRule="atLeast"/>
+          <w:trHeight w:val="579" w:hRule="atLeast"/>
           <w:tblHeader w:val="0"/>
         </w:trPr>
         <w:tc>
@@ -1511,7 +1511,7 @@
       <w:tr>
         <w:trPr>
           <w:cantSplit w:val="0"/>
-          <w:trHeight w:val="850" w:hRule="atLeast"/>
+          <w:trHeight w:val="694" w:hRule="atLeast"/>
           <w:tblHeader w:val="1"/>
         </w:trPr>
         <w:tc>
@@ -1746,7 +1746,7 @@
       <w:tr>
         <w:trPr>
           <w:cantSplit w:val="0"/>
-          <w:trHeight w:val="567" w:hRule="atLeast"/>
+          <w:trHeight w:val="406" w:hRule="atLeast"/>
           <w:tblHeader w:val="0"/>
         </w:trPr>
         <w:tc>
@@ -1933,7 +1933,7 @@
       <w:tr>
         <w:trPr>
           <w:cantSplit w:val="0"/>
-          <w:trHeight w:val="425" w:hRule="atLeast"/>
+          <w:trHeight w:val="258" w:hRule="atLeast"/>
           <w:tblHeader w:val="0"/>
         </w:trPr>
         <w:tc>
@@ -2930,6 +2930,391 @@
           <w:rtl w:val="0"/>
         </w:rPr>
         <w:t>{/attachments}</w:t>
+      </w:r>
+    </w:p>
+    <w:p>
+      <w:pPr>
+        <w:keepNext w:val="0"/>
+        <w:keepLines w:val="0"/>
+        <w:spacing w:after="0" w:before="0" w:line="240" w:lineRule="auto"/>
+        <w:rPr/>
+      </w:pPr>
+      <w:r>
+        <w:rPr>
+          <w:rFonts w:ascii="Times New Roman" w:cs="Times New Roman" w:eastAsia="Times New Roman" w:hAnsi="Times New Roman"/>
+          <w:bCs w:val="0"/>
+          <w:i w:val="0"/>
+          <w:iCs w:val="0"/>
+          <w:color w:val="111111"/>
+          <w:sz w:val="18"/>
+          <w:szCs w:val="18"/>
+          <w:rtl w:val="0"/>
+        </w:rPr>
+        <w:t/>
+      </w:r>
+    </w:p>
+    <w:p>
+      <w:pPr>
+        <w:pStyle w:val="Heading1"/>
+        <w:keepNext w:val="1"/>
+        <w:keepLines w:val="0"/>
+        <w:spacing w:after="20" w:before="80" w:line="240" w:lineRule="auto"/>
+        <w:rPr/>
+      </w:pPr>
+      <w:r>
+        <w:rPr>
+          <w:rFonts w:ascii="Times New Roman" w:cs="Times New Roman" w:eastAsia="Times New Roman" w:hAnsi="Times New Roman"/>
+          <w:b w:val="1"/>
+          <w:bCs w:val="1"/>
+          <w:i w:val="0"/>
+          <w:iCs w:val="0"/>
+          <w:color w:val="111111"/>
+          <w:sz w:val="24"/>
+          <w:szCs w:val="24"/>
+          <w:rtl w:val="0"/>
+        </w:rPr>
+        <w:t>6. MTÜ kinnitus ja finantsjuhi allkiri</w:t>
+      </w:r>
+    </w:p>
+    <w:p>
+      <w:pPr>
+        <w:keepNext w:val="1"/>
+        <w:keepLines w:val="0"/>
+        <w:spacing w:after="20" w:before="0" w:line="245" w:lineRule="auto"/>
+        <w:rPr/>
+      </w:pPr>
+      <w:r>
+        <w:rPr>
+          <w:rFonts w:ascii="Times New Roman" w:cs="Times New Roman" w:eastAsia="Times New Roman" w:hAnsi="Times New Roman"/>
+          <w:bCs w:val="0"/>
+          <w:i w:val="0"/>
+          <w:iCs w:val="0"/>
+          <w:color w:val="111111"/>
+          <w:sz w:val="18"/>
+          <w:szCs w:val="18"/>
+          <w:rtl w:val="0"/>
+        </w:rPr>
+        <w:t>Kinnitan esitatud kuluaruande kontrollimise ja taotletud {requestedTotal} hüvitamise.</w:t>
+      </w:r>
+    </w:p>
+    <w:tbl>
+      <w:tblPr>
+        <w:tblStyle w:val="Table5"/>
+        <w:tblW w:w="10440.0" w:type="dxa"/>
+        <w:jc w:val="left"/>
+        <w:tblInd w:w="-115.0" w:type="dxa"/>
+        <w:tblBorders>
+          <w:top w:color="a6a6a6" w:space="0" w:sz="6" w:val="single"/>
+          <w:left w:color="a6a6a6" w:space="0" w:sz="6" w:val="single"/>
+          <w:bottom w:color="a6a6a6" w:space="0" w:sz="6" w:val="single"/>
+          <w:right w:color="a6a6a6" w:space="0" w:sz="6" w:val="single"/>
+          <w:insideH w:color="a6a6a6" w:space="0" w:sz="6" w:val="single"/>
+          <w:insideV w:color="a6a6a6" w:space="0" w:sz="6" w:val="single"/>
+        </w:tblBorders>
+        <w:tblLayout w:type="fixed"/>
+        <w:tblLook w:val="0400"/>
+      </w:tblPr>
+      <w:tblGrid>
+        <w:gridCol w:w="2595"/>
+        <w:gridCol w:w="1800"/>
+        <w:gridCol w:w="3405"/>
+        <w:gridCol w:w="2640"/>
+      </w:tblGrid>
+      <w:tr>
+        <w:trPr>
+          <w:cantSplit w:val="1"/>
+          <w:tblHeader w:val="0"/>
+        </w:trPr>
+        <w:tc>
+          <w:tcPr>
+            <w:tcW w:w="2595" w:type="dxa"/>
+            <w:shd w:fill="d9eaf7" w:val="clear"/>
+            <w:tcMar>
+              <w:top w:w="85.0" w:type="dxa"/>
+              <w:bottom w:w="85.0" w:type="dxa"/>
+            </w:tcMar>
+            <w:vAlign w:val="center"/>
+          </w:tcPr>
+          <w:p>
+            <w:pPr>
+              <w:keepNext w:val="1"/>
+              <w:keepLines w:val="0"/>
+              <w:spacing w:after="0" w:before="0" w:line="240" w:lineRule="auto"/>
+              <w:jc w:val="left"/>
+              <w:rPr/>
+            </w:pPr>
+            <w:r>
+              <w:rPr>
+                <w:rFonts w:ascii="Times New Roman" w:cs="Times New Roman" w:eastAsia="Times New Roman" w:hAnsi="Times New Roman"/>
+                <w:b w:val="1"/>
+                <w:bCs w:val="1"/>
+                <w:i w:val="0"/>
+                <w:iCs w:val="0"/>
+                <w:color w:val="111111"/>
+                <w:sz w:val="18"/>
+                <w:szCs w:val="18"/>
+                <w:rtl w:val="0"/>
+              </w:rPr>
+              <w:t>Kinnitaja nimi</w:t>
+            </w:r>
+          </w:p>
+        </w:tc>
+        <w:tc>
+          <w:tcPr>
+            <w:tcW w:w="1800" w:type="dxa"/>
+            <w:shd w:fill="d9eaf7" w:val="clear"/>
+            <w:tcMar>
+              <w:top w:w="85.0" w:type="dxa"/>
+              <w:bottom w:w="85.0" w:type="dxa"/>
+            </w:tcMar>
+            <w:vAlign w:val="center"/>
+          </w:tcPr>
+          <w:p>
+            <w:pPr>
+              <w:keepNext w:val="1"/>
+              <w:keepLines w:val="0"/>
+              <w:spacing w:after="0" w:before="0" w:line="240" w:lineRule="auto"/>
+              <w:jc w:val="left"/>
+              <w:rPr/>
+            </w:pPr>
+            <w:r>
+              <w:rPr>
+                <w:rFonts w:ascii="Times New Roman" w:cs="Times New Roman" w:eastAsia="Times New Roman" w:hAnsi="Times New Roman"/>
+                <w:b w:val="1"/>
+                <w:bCs w:val="1"/>
+                <w:i w:val="0"/>
+                <w:iCs w:val="0"/>
+                <w:color w:val="111111"/>
+                <w:sz w:val="18"/>
+                <w:szCs w:val="18"/>
+                <w:rtl w:val="0"/>
+              </w:rPr>
+              <w:t>Amet</w:t>
+            </w:r>
+          </w:p>
+        </w:tc>
+        <w:tc>
+          <w:tcPr>
+            <w:tcW w:w="3405" w:type="dxa"/>
+            <w:shd w:fill="d9eaf7" w:val="clear"/>
+            <w:tcMar>
+              <w:top w:w="85.0" w:type="dxa"/>
+              <w:bottom w:w="85.0" w:type="dxa"/>
+            </w:tcMar>
+            <w:vAlign w:val="center"/>
+          </w:tcPr>
+          <w:p>
+            <w:pPr>
+              <w:keepNext w:val="1"/>
+              <w:keepLines w:val="0"/>
+              <w:spacing w:after="0" w:before="0" w:line="240" w:lineRule="auto"/>
+              <w:jc w:val="left"/>
+              <w:rPr/>
+            </w:pPr>
+            <w:r>
+              <w:rPr>
+                <w:rFonts w:ascii="Times New Roman" w:cs="Times New Roman" w:eastAsia="Times New Roman" w:hAnsi="Times New Roman"/>
+                <w:b w:val="1"/>
+                <w:bCs w:val="1"/>
+                <w:i w:val="0"/>
+                <w:iCs w:val="0"/>
+                <w:color w:val="111111"/>
+                <w:sz w:val="18"/>
+                <w:szCs w:val="18"/>
+                <w:rtl w:val="0"/>
+              </w:rPr>
+              <w:t>Allkiri</w:t>
+            </w:r>
+          </w:p>
+        </w:tc>
+        <w:tc>
+          <w:tcPr>
+            <w:tcW w:w="2640" w:type="dxa"/>
+            <w:shd w:fill="d9eaf7" w:val="clear"/>
+            <w:tcMar>
+              <w:top w:w="85.0" w:type="dxa"/>
+              <w:bottom w:w="85.0" w:type="dxa"/>
+            </w:tcMar>
+            <w:vAlign w:val="center"/>
+          </w:tcPr>
+          <w:p>
+            <w:pPr>
+              <w:keepNext w:val="1"/>
+              <w:keepLines w:val="0"/>
+              <w:spacing w:after="0" w:before="0" w:line="240" w:lineRule="auto"/>
+              <w:jc w:val="left"/>
+              <w:rPr/>
+            </w:pPr>
+            <w:r>
+              <w:rPr>
+                <w:rFonts w:ascii="Times New Roman" w:cs="Times New Roman" w:eastAsia="Times New Roman" w:hAnsi="Times New Roman"/>
+                <w:b w:val="1"/>
+                <w:bCs w:val="1"/>
+                <w:i w:val="0"/>
+                <w:iCs w:val="0"/>
+                <w:color w:val="111111"/>
+                <w:sz w:val="18"/>
+                <w:szCs w:val="18"/>
+                <w:rtl w:val="0"/>
+              </w:rPr>
+              <w:t>Kuupäev</w:t>
+            </w:r>
+          </w:p>
+        </w:tc>
+      </w:tr>
+      <w:tr>
+        <w:trPr>
+          <w:cantSplit w:val="1"/>
+          <w:tblHeader w:val="0"/>
+        </w:trPr>
+        <w:tc>
+          <w:tcPr>
+            <w:tcW w:w="2595" w:type="dxa"/>
+            <w:tcMar>
+              <w:top w:w="85.0" w:type="dxa"/>
+              <w:bottom w:w="85.0" w:type="dxa"/>
+            </w:tcMar>
+            <w:vAlign w:val="center"/>
+          </w:tcPr>
+          <w:p>
+            <w:pPr>
+              <w:keepNext w:val="1"/>
+              <w:keepLines w:val="0"/>
+              <w:spacing w:after="0" w:before="0" w:line="240" w:lineRule="auto"/>
+              <w:jc w:val="left"/>
+              <w:rPr/>
+            </w:pPr>
+            <w:r>
+              <w:rPr>
+                <w:rFonts w:ascii="Times New Roman" w:cs="Times New Roman" w:eastAsia="Times New Roman" w:hAnsi="Times New Roman"/>
+                <w:i w:val="0"/>
+                <w:iCs w:val="1"/>
+                <w:color w:val="111111"/>
+                <w:sz w:val="18"/>
+                <w:szCs w:val="18"/>
+                <w:rtl w:val="0"/>
+              </w:rPr>
+              <w:t>{financeApproverName}</w:t>
+            </w:r>
+          </w:p>
+        </w:tc>
+        <w:tc>
+          <w:tcPr>
+            <w:tcW w:w="1800" w:type="dxa"/>
+            <w:tcMar>
+              <w:top w:w="85.0" w:type="dxa"/>
+              <w:bottom w:w="85.0" w:type="dxa"/>
+            </w:tcMar>
+            <w:vAlign w:val="center"/>
+          </w:tcPr>
+          <w:p>
+            <w:pPr>
+              <w:keepNext w:val="1"/>
+              <w:keepLines w:val="0"/>
+              <w:spacing w:after="0" w:before="0" w:line="240" w:lineRule="auto"/>
+              <w:jc w:val="left"/>
+              <w:rPr/>
+            </w:pPr>
+            <w:r>
+              <w:rPr>
+                <w:rFonts w:ascii="Times New Roman" w:cs="Times New Roman" w:eastAsia="Times New Roman" w:hAnsi="Times New Roman"/>
+                <w:bCs w:val="0"/>
+                <w:i w:val="0"/>
+                <w:iCs w:val="0"/>
+                <w:color w:val="111111"/>
+                <w:sz w:val="18"/>
+                <w:szCs w:val="18"/>
+                <w:rtl w:val="0"/>
+              </w:rPr>
+              <w:t>{financeApproverRole}</w:t>
+            </w:r>
+          </w:p>
+        </w:tc>
+        <w:tc>
+          <w:tcPr>
+            <w:tcW w:w="3405" w:type="dxa"/>
+            <w:tcMar>
+              <w:top w:w="85.0" w:type="dxa"/>
+              <w:bottom w:w="85.0" w:type="dxa"/>
+            </w:tcMar>
+            <w:vAlign w:val="center"/>
+          </w:tcPr>
+          <w:p>
+            <w:pPr>
+              <w:keepNext w:val="1"/>
+              <w:keepLines w:val="0"/>
+              <w:spacing w:after="0" w:before="0" w:line="240" w:lineRule="auto"/>
+              <w:jc w:val="left"/>
+              <w:rPr/>
+            </w:pPr>
+            <w:r>
+              <w:rPr>
+                <w:rFonts w:ascii="Times New Roman" w:cs="Times New Roman" w:eastAsia="Times New Roman" w:hAnsi="Times New Roman"/>
+                <w:bCs w:val="0"/>
+                <w:i w:val="0"/>
+                <w:iCs w:val="0"/>
+                <w:color w:val="111111"/>
+                <w:sz w:val="18"/>
+                <w:szCs w:val="18"/>
+                <w:rtl w:val="0"/>
+              </w:rPr>
+              <w:t>{financeSignatureStatus}</w:t>
+            </w:r>
+          </w:p>
+        </w:tc>
+        <w:tc>
+          <w:tcPr>
+            <w:tcW w:w="2640" w:type="dxa"/>
+            <w:tcMar>
+              <w:top w:w="85.0" w:type="dxa"/>
+              <w:bottom w:w="85.0" w:type="dxa"/>
+            </w:tcMar>
+            <w:vAlign w:val="center"/>
+          </w:tcPr>
+          <w:p>
+            <w:pPr>
+              <w:keepNext w:val="1"/>
+              <w:keepLines w:val="0"/>
+              <w:spacing w:after="0" w:before="0" w:line="240" w:lineRule="auto"/>
+              <w:jc w:val="left"/>
+              <w:rPr/>
+            </w:pPr>
+            <w:r>
+              <w:rPr>
+                <w:rFonts w:ascii="Times New Roman" w:cs="Times New Roman" w:eastAsia="Times New Roman" w:hAnsi="Times New Roman"/>
+                <w:bCs w:val="0"/>
+                <w:i w:val="0"/>
+                <w:iCs w:val="0"/>
+                <w:color w:val="111111"/>
+                <w:sz w:val="18"/>
+                <w:szCs w:val="18"/>
+                <w:rtl w:val="0"/>
+              </w:rPr>
+              <w:t>{financeSignatureDate}</w:t>
+            </w:r>
+          </w:p>
+        </w:tc>
+      </w:tr>
+    </w:tbl>
+    <w:p>
+      <w:pPr>
+        <w:keepNext w:val="0"/>
+        <w:keepLines w:val="1"/>
+        <w:spacing w:after="0" w:before="80" w:line="276" w:lineRule="auto"/>
+        <w:rPr/>
+      </w:pPr>
+      <w:r>
+        <w:rPr>
+          <w:rFonts w:ascii="Times New Roman" w:cs="Times New Roman" w:eastAsia="Times New Roman" w:hAnsi="Times New Roman"/>
+          <w:bCs w:val="0"/>
+          <w:i w:val="0"/>
+          <w:iCs w:val="0"/>
+          <w:color w:val="111111"/>
+          <w:sz w:val="18"/>
+          <w:szCs w:val="18"/>
+          <w:rtl w:val="0"/>
+        </w:rPr>
+        <w:t>Käesolev dokument allkirjastatakse digitaalselt ning jõustub pärast viimase nõutava digitaalallkirja andmist. Allkirjastamise kuupäev ja kellaaeg tulenevad digitaalallkirja ajatemplist.</w:t>
       </w:r>
     </w:p>
     <w:sectPr>

</xml_diff>